<commit_message>
docs: finalize VM logs and Kanban snapshot
</commit_message>
<xml_diff>
--- a/docs/informe-final.docx
+++ b/docs/informe-final.docx
@@ -154,7 +154,7 @@
         <w:keepLines/>
       </w:pPr>
       <w:r>
-        <w:t>El alcance excluye historias clínicas reales, datos sensibles, bases de datos y alta disponibilidad de infraestructura. Falta incorporar al documento de entrega el gasto real de AWS y la confirmación del estado del tablero Trello. El PR del pipeline está abierto para integración al repositorio principal.</w:t>
+        <w:t>El alcance excluye historias clínicas reales, datos sensibles, bases de datos y alta disponibilidad de infraestructura. Falta incorporar al documento de entrega el gasto real de AWS. El estado visible del tablero Trello se registró mediante captura: cuatro tarjetas Por hacer, ninguna En curso, una A validar y trece Completado. El PR del pipeline está abierto para integración al repositorio principal.</w:t>
       </w:r>
     </w:p>
     <w:p>
@@ -2472,9 +2472,15 @@
             <w:pPr>
               <w:pStyle w:val="TableText"/>
             </w:pPr>
-            <w:r/>
             <w:r>
-              <w:t>Falta adjuntar Console Output para confirmar duración y estado final.</w:t>
+              <w:rPr>
+                <w:rFonts w:ascii="Consolas" w:hAnsi="Consolas"/>
+                <w:sz w:val="18"/>
+              </w:rPr>
+              <w:t>FAILURE</w:t>
+            </w:r>
+            <w:r>
+              <w:t xml:space="preserve"> esperado en pruebas, 2 s; etapas posteriores omitidas.</w:t>
             </w:r>
           </w:p>
         </w:tc>
@@ -2770,9 +2776,15 @@
             <w:pPr>
               <w:pStyle w:val="TableText"/>
             </w:pPr>
-            <w:r/>
             <w:r>
-              <w:t xml:space="preserve">La versión pública pasó de Green </w:t>
+              <w:rPr>
+                <w:rFonts w:ascii="Consolas" w:hAnsi="Consolas"/>
+                <w:sz w:val="18"/>
+              </w:rPr>
+              <w:t>SUCCESS</w:t>
+            </w:r>
+            <w:r>
+              <w:t xml:space="preserve">, 39 s; la versión pública pasó de Green </w:t>
             </w:r>
             <w:r>
               <w:rPr>
@@ -2792,7 +2804,7 @@
               <w:t>ci-6</w:t>
             </w:r>
             <w:r>
-              <w:t>; falta adjuntar Console Output.</w:t>
+              <w:t>.</w:t>
             </w:r>
           </w:p>
         </w:tc>
@@ -3001,7 +3013,7 @@
         <w:t>0 %</w:t>
       </w:r>
       <w:r>
-        <w:t xml:space="preserve"> corresponde específicamente al build #7.</w:t>
+        <w:t xml:space="preserve"> corresponde específicamente al build #7. El Console Output completo de #6 y un extracto del de #2 acompañan los CSV de la VM.</w:t>
       </w:r>
     </w:p>
     <w:p>
@@ -3286,9 +3298,8 @@
             <w:pPr>
               <w:pStyle w:val="TableText"/>
             </w:pPr>
-            <w:r/>
             <w:r>
-              <w:t>Tres repeticiones por escenario en local; en VM hay CSV de los tres escenarios, con logs de #2 pendientes de adjuntar.</w:t>
+              <w:t>Tres repeticiones por escenario en local; en VM hay CSV de los tres escenarios, con resultado y duración confirmados para #2, #3, #5, #6 y #7.</w:t>
             </w:r>
           </w:p>
         </w:tc>
@@ -3536,9 +3547,8 @@
             <w:pPr>
               <w:pStyle w:val="TableText"/>
             </w:pPr>
-            <w:r/>
             <w:r>
-              <w:t>La segunda entrega define EDT, responsables y enlaces. Falta verificar con el grupo el estado final del tablero y del cronograma.</w:t>
+              <w:t>La segunda entrega define EDT y responsables. La captura del tablero muestra 4 Por hacer, 0 En curso, 1 A validar y 13 Completado. Falta confirmar el cronograma definitivo y actualizar las tarjetas según la revisión grupal.</w:t>
             </w:r>
           </w:p>
         </w:tc>
@@ -3626,17 +3636,53 @@
         <w:keepLines/>
       </w:pPr>
       <w:r>
-        <w:t xml:space="preserve">La segunda entrega asigna gestión y documentación a Valentina, arquitectura e infraestructura a Germán, desarrollo y CI/CD a Ignacio, y QA y observabilidad a Joaquín. Define EDT 1.1–6.2, cronograma de dependencias y un tablero Kanban en Trello con las listas Por hacer, En curso, A validar y Completado. El repositorio identifica el tablero del Grupo 03 en </w:t>
+        <w:t xml:space="preserve">Según la segunda entrega, Valentina gestiona y documenta, Germán diseña la arquitectura e infraestructura, Ignacio desarrolla CI/CD y Joaquín cubre QA y observabilidad. La captura en </w:t>
       </w:r>
       <w:r>
         <w:rPr>
           <w:rFonts w:ascii="Consolas" w:hAnsi="Consolas"/>
           <w:sz w:val="18"/>
         </w:rPr>
-        <w:t>docs/agents/issue-tracker.md</w:t>
+        <w:t>docs/evidence/kanban-2026-10-25.png</w:t>
       </w:r>
       <w:r>
-        <w:t>. El estado actual de tarjetas, fechas reales y responsables finales no se pudo verificar desde el repositorio: debe completarse con una captura o exportación del tablero antes de entregar. Lo mismo aplica a la versión definitiva del Gantt.</w:t>
+        <w:t xml:space="preserve"> muestra </w:t>
+      </w:r>
+      <w:r>
+        <w:rPr>
+          <w:b/>
+        </w:rPr>
+        <w:t>4 Por hacer</w:t>
+      </w:r>
+      <w:r>
+        <w:t xml:space="preserve"> (3.1, 6.1, 6.2 y 6.3), </w:t>
+      </w:r>
+      <w:r>
+        <w:rPr>
+          <w:b/>
+        </w:rPr>
+        <w:t>0 En curso</w:t>
+      </w:r>
+      <w:r>
+        <w:t xml:space="preserve">, </w:t>
+      </w:r>
+      <w:r>
+        <w:rPr>
+          <w:b/>
+        </w:rPr>
+        <w:t>1 A validar</w:t>
+      </w:r>
+      <w:r>
+        <w:t xml:space="preserve"> (1.2) y </w:t>
+      </w:r>
+      <w:r>
+        <w:rPr>
+          <w:b/>
+        </w:rPr>
+        <w:t>13 Completado</w:t>
+      </w:r>
+      <w:r>
+        <w:t>. La imagen acredita el estado visible, pero no el detalle de cada tarjeta ni el Gantt. El grupo debe confirmar el cronograma definitivo y actualizar las tarjetas tras revisar esta entrega.</w:t>
       </w:r>
     </w:p>
     <w:p>
@@ -3708,7 +3754,7 @@
         <w:keepLines/>
       </w:pPr>
       <w:r>
-        <w:t>Para cerrar la entrega grupal faltan: incorporar el estado real de Trello y Gantt; completar el costo observado en AWS; adjuntar los Console Output de VM #2 y #6 si se desea cerrar esas filas; revisar el texto con los cuatro integrantes; y completar la descripción, revisión e integración del PR. Estos pendientes son documentales y de coordinación; no invalidan los resultados técnicos ya medidos.</w:t>
+        <w:t>Para cerrar la entrega grupal faltan: completar el costo observado en AWS; confirmar el Gantt y actualizar las tarjetas de Trello según la revisión grupal; revisar el texto con los cuatro integrantes; y completar la descripción, revisión e integración del PR. Estos pendientes son documentales y de coordinación; no invalidan los resultados técnicos ya medidos.</w:t>
       </w:r>
     </w:p>
     <w:sectPr>

</xml_diff>

<commit_message>
docs: plan incremental blue green consulting costs
</commit_message>
<xml_diff>
--- a/docs/informe-final.docx
+++ b/docs/informe-final.docx
@@ -154,7 +154,16 @@
         <w:keepLines/>
       </w:pPr>
       <w:r>
-        <w:t>El alcance excluye historias clínicas reales, datos sensibles, bases de datos y alta disponibilidad de infraestructura. Falta incorporar al documento de entrega el gasto real de AWS. El estado visible del tablero Trello se registró mediante captura: cuatro tarjetas Por hacer, ninguna En curso, una A validar y trece Completado. El PR del pipeline está abierto para integración al repositorio principal.</w:t>
+        <w:t xml:space="preserve">El alcance excluye historias clínicas reales, datos sensibles, bases de datos y alta disponibilidad de infraestructura. La cuenta Free solo financió la demostración. Para la clínica se preparó un </w:t>
+      </w:r>
+      <w:r>
+        <w:rPr>
+          <w:b/>
+        </w:rPr>
+        <w:t>plan de costos incremental</w:t>
+      </w:r>
+      <w:r>
+        <w:t xml:space="preserve"> que separa honorarios de consultoría y recursos AWS adicionales; el importe definitivo de AWS exige conocer la infraestructura y carga existentes. El estado visible del tablero Trello se registró mediante captura: cuatro tarjetas Por hacer, ninguna En curso, una A validar y trece Completado. El PR del pipeline está abierto para integración al repositorio principal.</w:t>
       </w:r>
     </w:p>
     <w:p>
@@ -3617,10 +3626,76 @@
         <w:rPr>
           <w:b/>
         </w:rPr>
-        <w:t>Costo.</w:t>
+        <w:t>Costo de la propuesta.</w:t>
       </w:r>
       <w:r>
-        <w:t xml:space="preserve"> La cuenta se creó en plan Free y la VM consume recursos de EC2 y almacenamiento mientras exista. No se dispone en el repositorio de un importe final verificado ni de una captura del presupuesto AWS, por lo que este informe no afirma costo cero. Antes de entregar, agregar el monto observado en Billing, el tipo de instancia, el tamaño del volumen y una captura del presupuesto o alerta. Al terminar la demo, revisar y terminar la instancia y los recursos asociados que ya no se necesiten.</w:t>
+        <w:t xml:space="preserve"> La Clínica Santa Lucía ya utiliza AWS, por lo que se presupuesta solo el </w:t>
+      </w:r>
+      <w:r>
+        <w:rPr>
+          <w:b/>
+        </w:rPr>
+        <w:t>incremento de Blue Green</w:t>
+      </w:r>
+      <w:r>
+        <w:t xml:space="preserve"> y los honorarios de la consultora. El </w:t>
+      </w:r>
+      <w:r>
+        <w:rPr>
+          <w:rFonts w:ascii="Consolas" w:hAnsi="Consolas"/>
+          <w:sz w:val="18"/>
+        </w:rPr>
+        <w:t>docs/plan-costos-consultoria.md</w:t>
+      </w:r>
+      <w:r>
+        <w:t xml:space="preserve"> supone 100 h iniciales y 8 h/mes. Con una tarifa </w:t>
+      </w:r>
+      <w:r>
+        <w:rPr>
+          <w:b/>
+        </w:rPr>
+        <w:t>hipotética de USD 40/h</w:t>
+      </w:r>
+      <w:r>
+        <w:t xml:space="preserve"> y 15 % de contingencia inicial, resulta </w:t>
+      </w:r>
+      <w:r>
+        <w:rPr>
+          <w:b/>
+        </w:rPr>
+        <w:t>USD 4600 una vez</w:t>
+      </w:r>
+      <w:r>
+        <w:t xml:space="preserve"> y </w:t>
+      </w:r>
+      <w:r>
+        <w:rPr>
+          <w:b/>
+        </w:rPr>
+        <w:t>USD 320/mes</w:t>
+      </w:r>
+      <w:r>
+        <w:t xml:space="preserve">; no es una oferta contractual. AWS se suma según segundo slot, almacenamiento y servicios que no puedan reutilizarse. El ejemplo del primer año es </w:t>
+      </w:r>
+      <w:r>
+        <w:rPr>
+          <w:rFonts w:ascii="Consolas" w:hAnsi="Consolas"/>
+          <w:sz w:val="18"/>
+        </w:rPr>
+        <w:t>USD 8440 + 13,8 × C_AWS</w:t>
+      </w:r>
+      <w:r>
+        <w:t xml:space="preserve">, con </w:t>
+      </w:r>
+      <w:r>
+        <w:rPr>
+          <w:rFonts w:ascii="Consolas" w:hAnsi="Consolas"/>
+          <w:sz w:val="18"/>
+        </w:rPr>
+        <w:t>C_AWS</w:t>
+      </w:r>
+      <w:r>
+        <w:t xml:space="preserve"> igual al costo mensual incremental estimado en AWS Pricing Calculator. El importe definitivo exige el inventario de TI; los créditos Free de la demo no se aplican a la clínica.</w:t>
       </w:r>
     </w:p>
     <w:p>
@@ -3754,7 +3829,7 @@
         <w:keepLines/>
       </w:pPr>
       <w:r>
-        <w:t>Para cerrar la entrega grupal faltan: completar el costo observado en AWS; confirmar el Gantt y actualizar las tarjetas de Trello según la revisión grupal; revisar el texto con los cuatro integrantes; y completar la descripción, revisión e integración del PR. Estos pendientes son documentales y de coordinación; no invalidan los resultados técnicos ya medidos.</w:t>
+        <w:t>Para cerrar la entrega grupal faltan: validar con la clínica las hipótesis de esfuerzo y capacidad para convertir el plan de costos en una cotización firme; confirmar el Gantt y actualizar las tarjetas de Trello según la revisión grupal; revisar el texto con los cuatro integrantes; y completar la descripción, revisión e integración del PR. Estos pendientes son de alcance y coordinación; no invalidan los resultados técnicos ya medidos.</w:t>
       </w:r>
     </w:p>
     <w:sectPr>

</xml_diff>

<commit_message>
feat(ci): require approval before blue green switch
</commit_message>
<xml_diff>
--- a/docs/informe-final.docx
+++ b/docs/informe-final.docx
@@ -893,7 +893,7 @@
         <w:keepLines/>
       </w:pPr>
       <w:r>
-        <w:t>El acceso público de la VM se expuso solo mediante túnel SSH hacia los puertos de loopback. El monitor corrió en Windows, fuera de Jenkins y fuera de la VM. Esta disposición permitió medir la respuesta que veía un cliente externo al laboratorio, aunque añadió latencia de túnel a las mediciones.</w:t>
+        <w:t>Durante las corridas documentadas de la VM, el acceso se realizó mediante túnel SSH hacia los puertos de loopback. El monitor corrió en Windows, fuera de Jenkins y fuera de la VM. Esta disposición permitió medir la respuesta que veía ese cliente externo al laboratorio, aunque añadió latencia de túnel a las mediciones.</w:t>
       </w:r>
     </w:p>
     <w:p>
@@ -909,37 +909,7 @@
         <w:keepLines/>
       </w:pPr>
       <w:r>
-        <w:t xml:space="preserve">El </w:t>
-      </w:r>
-      <w:r>
-        <w:rPr>
-          <w:rFonts w:ascii="Consolas" w:hAnsi="Consolas"/>
-          <w:sz w:val="18"/>
-        </w:rPr>
-        <w:t>Jenkinsfile</w:t>
-      </w:r>
-      <w:r>
-        <w:t xml:space="preserve"> ejecuta: obtención del commit; instalación y pruebas PHP; conexión a la red del laboratorio; construcción de la candidata; despliegue en el color inactivo; smoke test funcional; cambio de tráfico; observación de la URL pública. Registra </w:t>
-      </w:r>
-      <w:r>
-        <w:rPr>
-          <w:rFonts w:ascii="Consolas" w:hAnsi="Consolas"/>
-          <w:sz w:val="18"/>
-        </w:rPr>
-        <w:t>PIPELINE_DURATION_SECONDS</w:t>
-      </w:r>
-      <w:r>
-        <w:t xml:space="preserve"> al finalizar. El valor de </w:t>
-      </w:r>
-      <w:r>
-        <w:rPr>
-          <w:rFonts w:ascii="Consolas" w:hAnsi="Consolas"/>
-          <w:sz w:val="18"/>
-        </w:rPr>
-        <w:t>/version</w:t>
-      </w:r>
-      <w:r>
-        <w:t xml:space="preserve"> permite vincular cada observación con el build y el commit.</w:t>
+        <w:t>El Jenkinsfile obtiene el commit, ejecuta pruebas, construye y valida la candidata en el color inactivo. Antes del switch, una pausa de hasta 10 minutos muestra la versión y espera la autorización del ID clinica-santa-lucia. Jenkins registra quién aprobó, qué versión y cuándo; rechazo o timeout mantienen el color activo. Tras aprobar, revalida el destino, cambia tráfico y observa la URL pública. Las corridas cuantificadas en este informe ocurrieron antes de agregar el gate, que aún requiere ensayos propios.</w:t>
       </w:r>
     </w:p>
     <w:tbl>

</xml_diff>